<commit_message>
docs(blender): refina checklist de revalidacao mecanica e vias da pose library
</commit_message>
<xml_diff>
--- a/docs/ARENAMON_Manual_Blender_Para_Agentes_IA_V2.docx
+++ b/docs/ARENAMON_Manual_Blender_Para_Agentes_IA_V2.docx
@@ -5037,213 +5037,11 @@
       </w:r>
     </w:p>
     <w:p>
-      <w:r>
-        <w:rPr>
-          <w:b/>
-        </w:rPr>
-        <w:t>Campos que ficam só salvos (`applied:false`) em `animation-profile.js`:</w:t>
-      </w:r>
-      <w:r>
-        <w:rPr/>
-        <w:t xml:space="preserve"> </w:t>
-      </w:r>
-      <w:r>
-        <w:rPr>
-          <w:rFonts w:ascii="Consolas" w:hAnsi="Consolas"/>
-          <w:sz w:val="18"/>
-        </w:rPr>
-        <w:t>startup</w:t>
-      </w:r>
-      <w:r>
-        <w:rPr/>
-        <w:t xml:space="preserve">, </w:t>
-      </w:r>
-      <w:r>
-        <w:rPr>
-          <w:rFonts w:ascii="Consolas" w:hAnsi="Consolas"/>
-          <w:sz w:val="18"/>
-        </w:rPr>
-        <w:t>priority</w:t>
-      </w:r>
-      <w:r>
-        <w:rPr/>
-        <w:t xml:space="preserve"> (camada), </w:t>
-      </w:r>
-      <w:r>
-        <w:rPr>
-          <w:rFonts w:ascii="Consolas" w:hAnsi="Consolas"/>
-          <w:sz w:val="18"/>
-        </w:rPr>
-        <w:t>repeats</w:t>
-      </w:r>
-      <w:r>
-        <w:rPr/>
-        <w:t xml:space="preserve">, </w:t>
-      </w:r>
-      <w:r>
-        <w:rPr>
-          <w:rFonts w:ascii="Consolas" w:hAnsi="Consolas"/>
-          <w:sz w:val="18"/>
-        </w:rPr>
-        <w:t>exitCondition</w:t>
-      </w:r>
-      <w:r>
-        <w:rPr/>
-        <w:t xml:space="preserve">, </w:t>
-      </w:r>
-      <w:r>
-        <w:rPr>
-          <w:rFonts w:ascii="Consolas" w:hAnsi="Consolas"/>
-          <w:sz w:val="18"/>
-        </w:rPr>
-        <w:t>displacement</w:t>
-      </w:r>
-      <w:r>
-        <w:rPr/>
-        <w:t xml:space="preserve">, </w:t>
-      </w:r>
-      <w:r>
-        <w:rPr>
-          <w:rFonts w:ascii="Consolas" w:hAnsi="Consolas"/>
-          <w:sz w:val="18"/>
-        </w:rPr>
-        <w:t>verticalSpeed</w:t>
-      </w:r>
-      <w:r>
-        <w:rPr/>
-        <w:t xml:space="preserve">, </w:t>
-      </w:r>
-      <w:r>
-        <w:rPr>
-          <w:rFonts w:ascii="Consolas" w:hAnsi="Consolas"/>
-          <w:sz w:val="18"/>
-        </w:rPr>
-        <w:t>minTime</w:t>
-      </w:r>
-      <w:r>
-        <w:rPr/>
-        <w:t xml:space="preserve">, </w:t>
-      </w:r>
-      <w:r>
-        <w:rPr>
-          <w:rFonts w:ascii="Consolas" w:hAnsi="Consolas"/>
-          <w:sz w:val="18"/>
-        </w:rPr>
-        <w:t>autoNext</w:t>
-      </w:r>
-      <w:r>
-        <w:rPr/>
-        <w:t>. Não os apresente como efeito implementado. Exemplos com efeito (</w:t>
-      </w:r>
-      <w:r>
-        <w:rPr>
-          <w:rFonts w:ascii="Consolas" w:hAnsi="Consolas"/>
-          <w:sz w:val="18"/>
-        </w:rPr>
-        <w:t>applied:true</w:t>
-      </w:r>
-      <w:r>
-        <w:rPr/>
-        <w:t xml:space="preserve">): </w:t>
-      </w:r>
-      <w:r>
-        <w:rPr>
-          <w:rFonts w:ascii="Consolas" w:hAnsi="Consolas"/>
-          <w:sz w:val="18"/>
-        </w:rPr>
-        <w:t>armor</w:t>
-      </w:r>
-      <w:r>
-        <w:rPr/>
-        <w:t xml:space="preserve">, </w:t>
-      </w:r>
-      <w:r>
-        <w:rPr>
-          <w:rFonts w:ascii="Consolas" w:hAnsi="Consolas"/>
-          <w:sz w:val="18"/>
-        </w:rPr>
-        <w:t>hitstopMult</w:t>
-      </w:r>
-      <w:r>
-        <w:rPr/>
-        <w:t xml:space="preserve">, </w:t>
-      </w:r>
-      <w:r>
-        <w:rPr>
-          <w:rFonts w:ascii="Consolas" w:hAnsi="Consolas"/>
-          <w:sz w:val="18"/>
-        </w:rPr>
-        <w:t>interruptible</w:t>
-      </w:r>
-      <w:r>
-        <w:rPr/>
-        <w:t xml:space="preserve">, as janelas acima, </w:t>
-      </w:r>
-      <w:r>
-        <w:rPr>
-          <w:rFonts w:ascii="Consolas" w:hAnsi="Consolas"/>
-          <w:sz w:val="18"/>
-        </w:rPr>
-        <w:t>rootMotion</w:t>
-      </w:r>
-      <w:r>
-        <w:rPr/>
-        <w:t xml:space="preserve"> e </w:t>
-      </w:r>
-      <w:r>
-        <w:rPr>
-          <w:rFonts w:ascii="Consolas" w:hAnsi="Consolas"/>
-          <w:sz w:val="18"/>
-        </w:rPr>
-        <w:t>lockToGround</w:t>
-      </w:r>
-      <w:r>
-        <w:rPr/>
-        <w:t>.</w:t>
-      </w:r>
-    </w:p>
-    <w:p>
-      <w:r>
-        <w:rPr>
-          <w:b/>
-        </w:rPr>
-        <w:t>Consequência prática:</w:t>
-      </w:r>
-      <w:r>
-        <w:rPr/>
-        <w:t xml:space="preserve"> depois de retimar um golpe, compare o frame visual de contato com a janela ativa efetiva. Se não baterem, relate o desencontro e proponha um ajuste (evento, perfil ou animação). Não corrija a mecânica sozinho.</w:t>
-      </w:r>
-    </w:p>
-    <w:p>
-      <w:pPr>
-        <w:pStyle w:val="Heading1"/>
-      </w:pPr>
-      <w:r>
-        <w:t>7. Técnicas nativas do Blender 5.2 (quando decidir na interface)</w:t>
-      </w:r>
-    </w:p>
-    <w:p>
-      <w:r>
-        <w:rPr/>
-        <w:t xml:space="preserve">Menus e atalhos variam com a versão e o keymap. Na dúvida, use </w:t>
-      </w:r>
-      <w:r>
-        <w:rPr>
-          <w:b/>
-        </w:rPr>
-        <w:t>F3 (Search)</w:t>
-      </w:r>
-      <w:r>
-        <w:rPr/>
-        <w:t>, registre o operador encontrado e não invente caminhos.</w:t>
-      </w:r>
-    </w:p>
-    <w:p>
       <w:pPr>
         <w:pStyle w:val="Heading2"/>
       </w:pPr>
       <w:r>
-        <w:t>7.1 Ferramentas</w:t>
+        <w:t>6.1 Quais alterações exigem nova validação mecânica (checklist)</w:t>
       </w:r>
     </w:p>
     <w:tbl>
@@ -5271,7 +5069,7 @@
                 <w:color w:val="FFFFFF"/>
                 <w:sz w:val="17"/>
               </w:rPr>
-              <w:t>Técnica</w:t>
+              <w:t>Tipo de alteração no Blender</w:t>
             </w:r>
           </w:p>
         </w:tc>
@@ -5287,7 +5085,7 @@
                 <w:color w:val="FFFFFF"/>
                 <w:sz w:val="17"/>
               </w:rPr>
-              <w:t>Onde</w:t>
+              <w:t>Afeta a mecânica do jogo?</w:t>
             </w:r>
           </w:p>
         </w:tc>
@@ -5303,7 +5101,7 @@
                 <w:color w:val="FFFFFF"/>
                 <w:sz w:val="17"/>
               </w:rPr>
-              <w:t>Uso correto</w:t>
+              <w:t>Exige revalidação no Combat Lab?</w:t>
             </w:r>
           </w:p>
         </w:tc>
@@ -5319,7 +5117,7 @@
                 <w:color w:val="FFFFFF"/>
                 <w:sz w:val="17"/>
               </w:rPr>
-              <w:t>Limite para o jogo</w:t>
+              <w:t>O que verificar</w:t>
             </w:r>
           </w:p>
         </w:tc>
@@ -5332,9 +5130,16 @@
           <w:p>
             <w:r>
               <w:rPr>
-                <w:sz w:val="16"/>
-              </w:rPr>
-              <w:t>Graph Editor</w:t>
+                <w:b/>
+                <w:sz w:val="16"/>
+              </w:rPr>
+              <w:t>Ajuste de poses e curvas internas</w:t>
+            </w:r>
+            <w:r>
+              <w:rPr>
+                <w:sz w:val="16"/>
+              </w:rPr>
+              <w:t xml:space="preserve"> (arcos, easing, silhueta) mantendo duração e eventos intactos</w:t>
             </w:r>
           </w:p>
         </w:tc>
@@ -5345,9 +5150,16 @@
           <w:p>
             <w:r>
               <w:rPr>
-                <w:sz w:val="16"/>
-              </w:rPr>
-              <w:t>Editor Type › Graph Editor; Key › Interpolation Mode / Handle Type</w:t>
+                <w:b/>
+                <w:sz w:val="16"/>
+              </w:rPr>
+              <w:t>Não</w:t>
+            </w:r>
+            <w:r>
+              <w:rPr>
+                <w:sz w:val="16"/>
+              </w:rPr>
+              <w:t xml:space="preserve"> (a física e os tempos mecânicos permanecem idênticos)</w:t>
             </w:r>
           </w:p>
         </w:tc>
@@ -5360,7 +5172,7 @@
               <w:rPr>
                 <w:sz w:val="16"/>
               </w:rPr>
-              <w:t>Spacing, easing, arcos, overshoot</w:t>
+              <w:t>Opcional (apenas inspeção visual)</w:t>
             </w:r>
           </w:p>
         </w:tc>
@@ -5373,20 +5185,7 @@
               <w:rPr>
                 <w:sz w:val="16"/>
               </w:rPr>
-              <w:t xml:space="preserve">Curva visual ≠ deslocamento físico (root vem da física salvo </w:t>
-            </w:r>
-            <w:r>
-              <w:rPr>
-                <w:rFonts w:ascii="Consolas" w:hAnsi="Consolas"/>
-                <w:sz w:val="16"/>
-              </w:rPr>
-              <w:t>rootMotion</w:t>
-            </w:r>
-            <w:r>
-              <w:rPr>
-                <w:sz w:val="16"/>
-              </w:rPr>
-              <w:t>)</w:t>
+              <w:t>Verificar se o impacto visual ainda coincide aproximadamente com a janela ativa</w:t>
             </w:r>
           </w:p>
         </w:tc>
@@ -5399,9 +5198,16 @@
           <w:p>
             <w:r>
               <w:rPr>
-                <w:sz w:val="16"/>
-              </w:rPr>
-              <w:t>Dope Sheet / Action Editor</w:t>
+                <w:b/>
+                <w:sz w:val="16"/>
+              </w:rPr>
+              <w:t>Mudar a duração total do clipe</w:t>
+            </w:r>
+            <w:r>
+              <w:rPr>
+                <w:sz w:val="16"/>
+              </w:rPr>
+              <w:t xml:space="preserve"> com eventos no GLB</w:t>
             </w:r>
           </w:p>
         </w:tc>
@@ -5412,16 +5218,29 @@
           <w:p>
             <w:r>
               <w:rPr>
-                <w:sz w:val="16"/>
-              </w:rPr>
-              <w:t xml:space="preserve">Dope Sheet › Action Editor; seletor de Action </w:t>
-            </w:r>
-            <w:r>
-              <w:rPr>
                 <w:b/>
                 <w:sz w:val="16"/>
               </w:rPr>
-              <w:t>e de slot</w:t>
+              <w:t>Sim</w:t>
+            </w:r>
+            <w:r>
+              <w:rPr>
+                <w:sz w:val="16"/>
+              </w:rPr>
+              <w:t xml:space="preserve"> (em </w:t>
+            </w:r>
+            <w:r>
+              <w:rPr>
+                <w:rFonts w:ascii="Consolas" w:hAnsi="Consolas"/>
+                <w:sz w:val="16"/>
+              </w:rPr>
+              <w:t>phaseMode = 1</w:t>
+            </w:r>
+            <w:r>
+              <w:rPr>
+                <w:sz w:val="16"/>
+              </w:rPr>
+              <w:t xml:space="preserve"> com eventos GLB, a proporção evento/duração desloca as janelas)</w:t>
             </w:r>
           </w:p>
         </w:tc>
@@ -5432,9 +5251,10 @@
           <w:p>
             <w:r>
               <w:rPr>
-                <w:sz w:val="16"/>
-              </w:rPr>
-              <w:t>Duplicar Action, organizar poses-chave</w:t>
+                <w:b/>
+                <w:sz w:val="16"/>
+              </w:rPr>
+              <w:t>Sim (obrigatória)</w:t>
             </w:r>
           </w:p>
         </w:tc>
@@ -5447,7 +5267,20 @@
               <w:rPr>
                 <w:sz w:val="16"/>
               </w:rPr>
-              <w:t>Confira se a chave caiu na Action/slot pretendido</w:t>
+              <w:t xml:space="preserve">Rechecar </w:t>
+            </w:r>
+            <w:r>
+              <w:rPr>
+                <w:rFonts w:ascii="Consolas" w:hAnsi="Consolas"/>
+                <w:sz w:val="16"/>
+              </w:rPr>
+              <w:t>getCombatWindows()</w:t>
+            </w:r>
+            <w:r>
+              <w:rPr>
+                <w:sz w:val="16"/>
+              </w:rPr>
+              <w:t xml:space="preserve"> no console do Lab e rodar teste de combate</w:t>
             </w:r>
           </w:p>
         </w:tc>
@@ -5460,9 +5293,42 @@
           <w:p>
             <w:r>
               <w:rPr>
-                <w:sz w:val="16"/>
-              </w:rPr>
-              <w:t>Pose Library</w:t>
+                <w:b/>
+                <w:sz w:val="16"/>
+              </w:rPr>
+              <w:t>Adicionar, mover ou apagar marcadores de eventos</w:t>
+            </w:r>
+            <w:r>
+              <w:rPr>
+                <w:sz w:val="16"/>
+              </w:rPr>
+              <w:t xml:space="preserve"> (</w:t>
+            </w:r>
+            <w:r>
+              <w:rPr>
+                <w:rFonts w:ascii="Consolas" w:hAnsi="Consolas"/>
+                <w:sz w:val="16"/>
+              </w:rPr>
+              <w:t>hitbox_on/off</w:t>
+            </w:r>
+            <w:r>
+              <w:rPr>
+                <w:sz w:val="16"/>
+              </w:rPr>
+              <w:t xml:space="preserve">, </w:t>
+            </w:r>
+            <w:r>
+              <w:rPr>
+                <w:rFonts w:ascii="Consolas" w:hAnsi="Consolas"/>
+                <w:sz w:val="16"/>
+              </w:rPr>
+              <w:t>invuln_*</w:t>
+            </w:r>
+            <w:r>
+              <w:rPr>
+                <w:sz w:val="16"/>
+              </w:rPr>
+              <w:t>, etc.)</w:t>
             </w:r>
           </w:p>
         </w:tc>
@@ -5473,9 +5339,640 @@
           <w:p>
             <w:r>
               <w:rPr>
-                <w:sz w:val="16"/>
-              </w:rPr>
-              <w:t>Asset Shelf da viewport em Pose Mode; Pose › Create Pose Asset</w:t>
+                <w:b/>
+                <w:sz w:val="16"/>
+              </w:rPr>
+              <w:t>Sim</w:t>
+            </w:r>
+            <w:r>
+              <w:rPr>
+                <w:sz w:val="16"/>
+              </w:rPr>
+              <w:t xml:space="preserve"> (altera o contrato canônico </w:t>
+            </w:r>
+            <w:r>
+              <w:rPr>
+                <w:rFonts w:ascii="Consolas" w:hAnsi="Consolas"/>
+                <w:sz w:val="16"/>
+              </w:rPr>
+              <w:t>AnimationCombatWindows</w:t>
+            </w:r>
+            <w:r>
+              <w:rPr>
+                <w:sz w:val="16"/>
+              </w:rPr>
+              <w:t>)</w:t>
+            </w:r>
+          </w:p>
+        </w:tc>
+        <w:tc>
+          <w:tcPr>
+            <w:tcW w:type="dxa" w:w="2469"/>
+          </w:tcPr>
+          <w:p>
+            <w:r>
+              <w:rPr>
+                <w:b/>
+                <w:sz w:val="16"/>
+              </w:rPr>
+              <w:t>Sim (obrigatória)</w:t>
+            </w:r>
+          </w:p>
+        </w:tc>
+        <w:tc>
+          <w:tcPr>
+            <w:tcW w:type="dxa" w:w="2469"/>
+          </w:tcPr>
+          <w:p>
+            <w:r>
+              <w:rPr>
+                <w:sz w:val="16"/>
+              </w:rPr>
+              <w:t>Conferir no Studio se os pares início/fim estão na ordem correta e fecham intervalos válidos</w:t>
+            </w:r>
+          </w:p>
+        </w:tc>
+      </w:tr>
+      <w:tr>
+        <w:tc>
+          <w:tcPr>
+            <w:tcW w:type="dxa" w:w="2469"/>
+          </w:tcPr>
+          <w:p>
+            <w:r>
+              <w:rPr>
+                <w:b/>
+                <w:sz w:val="16"/>
+              </w:rPr>
+              <w:t>Retimar o golpe (adiantar/atrasar o frame do contato)</w:t>
+            </w:r>
+            <w:r>
+              <w:rPr>
+                <w:sz w:val="16"/>
+              </w:rPr>
+              <w:t xml:space="preserve"> sob perfil existente</w:t>
+            </w:r>
+          </w:p>
+        </w:tc>
+        <w:tc>
+          <w:tcPr>
+            <w:tcW w:type="dxa" w:w="2469"/>
+          </w:tcPr>
+          <w:p>
+            <w:r>
+              <w:rPr>
+                <w:b/>
+                <w:sz w:val="16"/>
+              </w:rPr>
+              <w:t>Indireto</w:t>
+            </w:r>
+            <w:r>
+              <w:rPr>
+                <w:sz w:val="16"/>
+              </w:rPr>
+              <w:t xml:space="preserve"> (a janela mecânica fica fixa no perfil, mas o golpe bate «no ar» ou antes da hora)</w:t>
+            </w:r>
+          </w:p>
+        </w:tc>
+        <w:tc>
+          <w:tcPr>
+            <w:tcW w:type="dxa" w:w="2469"/>
+          </w:tcPr>
+          <w:p>
+            <w:r>
+              <w:rPr>
+                <w:b/>
+                <w:sz w:val="16"/>
+              </w:rPr>
+              <w:t>Sim (obrigatória)</w:t>
+            </w:r>
+          </w:p>
+        </w:tc>
+        <w:tc>
+          <w:tcPr>
+            <w:tcW w:type="dxa" w:w="2469"/>
+          </w:tcPr>
+          <w:p>
+            <w:r>
+              <w:rPr>
+                <w:sz w:val="16"/>
+              </w:rPr>
+              <w:t>Comparar o frame do impacto no visual com o início da janela ativa no Lab</w:t>
+            </w:r>
+          </w:p>
+        </w:tc>
+      </w:tr>
+      <w:tr>
+        <w:tc>
+          <w:tcPr>
+            <w:tcW w:type="dxa" w:w="2469"/>
+          </w:tcPr>
+          <w:p>
+            <w:r>
+              <w:rPr>
+                <w:b/>
+                <w:sz w:val="16"/>
+              </w:rPr>
+              <w:t>Alterar `rootMotion` ou `lockToGround`</w:t>
+            </w:r>
+            <w:r>
+              <w:rPr>
+                <w:sz w:val="16"/>
+              </w:rPr>
+              <w:t xml:space="preserve"> no perfil</w:t>
+            </w:r>
+          </w:p>
+        </w:tc>
+        <w:tc>
+          <w:tcPr>
+            <w:tcW w:type="dxa" w:w="2469"/>
+          </w:tcPr>
+          <w:p>
+            <w:r>
+              <w:rPr>
+                <w:b/>
+                <w:sz w:val="16"/>
+              </w:rPr>
+              <w:t>Sim</w:t>
+            </w:r>
+            <w:r>
+              <w:rPr>
+                <w:sz w:val="16"/>
+              </w:rPr>
+              <w:t xml:space="preserve"> (muda o deslocamento físico e a ancoragem vertical)</w:t>
+            </w:r>
+          </w:p>
+        </w:tc>
+        <w:tc>
+          <w:tcPr>
+            <w:tcW w:type="dxa" w:w="2469"/>
+          </w:tcPr>
+          <w:p>
+            <w:r>
+              <w:rPr>
+                <w:b/>
+                <w:sz w:val="16"/>
+              </w:rPr>
+              <w:t>Sim (obrigatória)</w:t>
+            </w:r>
+          </w:p>
+        </w:tc>
+        <w:tc>
+          <w:tcPr>
+            <w:tcW w:type="dxa" w:w="2469"/>
+          </w:tcPr>
+          <w:p>
+            <w:r>
+              <w:rPr>
+                <w:sz w:val="16"/>
+              </w:rPr>
+              <w:t>Verificar colisão com paredes, alcance efetivo do golpe e travamento no piso</w:t>
+            </w:r>
+          </w:p>
+        </w:tc>
+      </w:tr>
+    </w:tbl>
+    <w:p/>
+    <w:p>
+      <w:r>
+        <w:rPr>
+          <w:b/>
+        </w:rPr>
+        <w:t>Campos que ficam só salvos (`applied:false`) em `animation-profile.js`:</w:t>
+      </w:r>
+      <w:r>
+        <w:rPr/>
+        <w:t xml:space="preserve"> </w:t>
+      </w:r>
+      <w:r>
+        <w:rPr>
+          <w:rFonts w:ascii="Consolas" w:hAnsi="Consolas"/>
+          <w:sz w:val="18"/>
+        </w:rPr>
+        <w:t>startup</w:t>
+      </w:r>
+      <w:r>
+        <w:rPr/>
+        <w:t xml:space="preserve">, </w:t>
+      </w:r>
+      <w:r>
+        <w:rPr>
+          <w:rFonts w:ascii="Consolas" w:hAnsi="Consolas"/>
+          <w:sz w:val="18"/>
+        </w:rPr>
+        <w:t>priority</w:t>
+      </w:r>
+      <w:r>
+        <w:rPr/>
+        <w:t xml:space="preserve"> (camada), </w:t>
+      </w:r>
+      <w:r>
+        <w:rPr>
+          <w:rFonts w:ascii="Consolas" w:hAnsi="Consolas"/>
+          <w:sz w:val="18"/>
+        </w:rPr>
+        <w:t>repeats</w:t>
+      </w:r>
+      <w:r>
+        <w:rPr/>
+        <w:t xml:space="preserve">, </w:t>
+      </w:r>
+      <w:r>
+        <w:rPr>
+          <w:rFonts w:ascii="Consolas" w:hAnsi="Consolas"/>
+          <w:sz w:val="18"/>
+        </w:rPr>
+        <w:t>exitCondition</w:t>
+      </w:r>
+      <w:r>
+        <w:rPr/>
+        <w:t xml:space="preserve">, </w:t>
+      </w:r>
+      <w:r>
+        <w:rPr>
+          <w:rFonts w:ascii="Consolas" w:hAnsi="Consolas"/>
+          <w:sz w:val="18"/>
+        </w:rPr>
+        <w:t>displacement</w:t>
+      </w:r>
+      <w:r>
+        <w:rPr/>
+        <w:t xml:space="preserve">, </w:t>
+      </w:r>
+      <w:r>
+        <w:rPr>
+          <w:rFonts w:ascii="Consolas" w:hAnsi="Consolas"/>
+          <w:sz w:val="18"/>
+        </w:rPr>
+        <w:t>verticalSpeed</w:t>
+      </w:r>
+      <w:r>
+        <w:rPr/>
+        <w:t xml:space="preserve">, </w:t>
+      </w:r>
+      <w:r>
+        <w:rPr>
+          <w:rFonts w:ascii="Consolas" w:hAnsi="Consolas"/>
+          <w:sz w:val="18"/>
+        </w:rPr>
+        <w:t>minTime</w:t>
+      </w:r>
+      <w:r>
+        <w:rPr/>
+        <w:t xml:space="preserve">, </w:t>
+      </w:r>
+      <w:r>
+        <w:rPr>
+          <w:rFonts w:ascii="Consolas" w:hAnsi="Consolas"/>
+          <w:sz w:val="18"/>
+        </w:rPr>
+        <w:t>autoNext</w:t>
+      </w:r>
+      <w:r>
+        <w:rPr/>
+        <w:t>. Não os apresente como efeito implementado. Exemplos com efeito (</w:t>
+      </w:r>
+      <w:r>
+        <w:rPr>
+          <w:rFonts w:ascii="Consolas" w:hAnsi="Consolas"/>
+          <w:sz w:val="18"/>
+        </w:rPr>
+        <w:t>applied:true</w:t>
+      </w:r>
+      <w:r>
+        <w:rPr/>
+        <w:t xml:space="preserve">): </w:t>
+      </w:r>
+      <w:r>
+        <w:rPr>
+          <w:rFonts w:ascii="Consolas" w:hAnsi="Consolas"/>
+          <w:sz w:val="18"/>
+        </w:rPr>
+        <w:t>armor</w:t>
+      </w:r>
+      <w:r>
+        <w:rPr/>
+        <w:t xml:space="preserve">, </w:t>
+      </w:r>
+      <w:r>
+        <w:rPr>
+          <w:rFonts w:ascii="Consolas" w:hAnsi="Consolas"/>
+          <w:sz w:val="18"/>
+        </w:rPr>
+        <w:t>hitstopMult</w:t>
+      </w:r>
+      <w:r>
+        <w:rPr/>
+        <w:t xml:space="preserve">, </w:t>
+      </w:r>
+      <w:r>
+        <w:rPr>
+          <w:rFonts w:ascii="Consolas" w:hAnsi="Consolas"/>
+          <w:sz w:val="18"/>
+        </w:rPr>
+        <w:t>interruptible</w:t>
+      </w:r>
+      <w:r>
+        <w:rPr/>
+        <w:t xml:space="preserve">, as janelas acima, </w:t>
+      </w:r>
+      <w:r>
+        <w:rPr>
+          <w:rFonts w:ascii="Consolas" w:hAnsi="Consolas"/>
+          <w:sz w:val="18"/>
+        </w:rPr>
+        <w:t>rootMotion</w:t>
+      </w:r>
+      <w:r>
+        <w:rPr/>
+        <w:t xml:space="preserve"> e </w:t>
+      </w:r>
+      <w:r>
+        <w:rPr>
+          <w:rFonts w:ascii="Consolas" w:hAnsi="Consolas"/>
+          <w:sz w:val="18"/>
+        </w:rPr>
+        <w:t>lockToGround</w:t>
+      </w:r>
+      <w:r>
+        <w:rPr/>
+        <w:t>.</w:t>
+      </w:r>
+    </w:p>
+    <w:p>
+      <w:r>
+        <w:rPr>
+          <w:b/>
+        </w:rPr>
+        <w:t>Consequência prática:</w:t>
+      </w:r>
+      <w:r>
+        <w:rPr/>
+        <w:t xml:space="preserve"> depois de retimar um golpe, compare o frame visual de contato com a janela ativa efetiva. Se não baterem, relate o desencontro e proponha um ajuste (evento, perfil ou animação). Não corrija a mecânica sozinho.</w:t>
+      </w:r>
+    </w:p>
+    <w:p>
+      <w:pPr>
+        <w:pStyle w:val="Heading1"/>
+      </w:pPr>
+      <w:r>
+        <w:t>7. Técnicas nativas do Blender 5.2 (quando decidir na interface)</w:t>
+      </w:r>
+    </w:p>
+    <w:p>
+      <w:r>
+        <w:rPr/>
+        <w:t xml:space="preserve">Menus e atalhos variam com a versão e o keymap. Na dúvida, use </w:t>
+      </w:r>
+      <w:r>
+        <w:rPr>
+          <w:b/>
+        </w:rPr>
+        <w:t>F3 (Search)</w:t>
+      </w:r>
+      <w:r>
+        <w:rPr/>
+        <w:t>, registre o operador encontrado e não invente caminhos.</w:t>
+      </w:r>
+    </w:p>
+    <w:p>
+      <w:pPr>
+        <w:pStyle w:val="Heading2"/>
+      </w:pPr>
+      <w:r>
+        <w:t>7.1 Ferramentas</w:t>
+      </w:r>
+    </w:p>
+    <w:tbl>
+      <w:tblPr>
+        <w:tblStyle w:val="TableGrid"/>
+        <w:tblW w:type="auto" w:w="0"/>
+        <w:tblLook w:firstColumn="1" w:firstRow="1" w:lastColumn="0" w:lastRow="0" w:noHBand="0" w:noVBand="1" w:val="04A0"/>
+      </w:tblPr>
+      <w:tblGrid>
+        <w:gridCol w:w="2469"/>
+        <w:gridCol w:w="2469"/>
+        <w:gridCol w:w="2469"/>
+        <w:gridCol w:w="2469"/>
+      </w:tblGrid>
+      <w:tr>
+        <w:tc>
+          <w:tcPr>
+            <w:tcW w:type="dxa" w:w="2469"/>
+            <w:shd w:val="clear" w:color="auto" w:fill="18354A"/>
+          </w:tcPr>
+          <w:p>
+            <w:r>
+              <w:rPr>
+                <w:b/>
+                <w:color w:val="FFFFFF"/>
+                <w:sz w:val="17"/>
+              </w:rPr>
+              <w:t>Técnica</w:t>
+            </w:r>
+          </w:p>
+        </w:tc>
+        <w:tc>
+          <w:tcPr>
+            <w:tcW w:type="dxa" w:w="2469"/>
+            <w:shd w:val="clear" w:color="auto" w:fill="18354A"/>
+          </w:tcPr>
+          <w:p>
+            <w:r>
+              <w:rPr>
+                <w:b/>
+                <w:color w:val="FFFFFF"/>
+                <w:sz w:val="17"/>
+              </w:rPr>
+              <w:t>Onde</w:t>
+            </w:r>
+          </w:p>
+        </w:tc>
+        <w:tc>
+          <w:tcPr>
+            <w:tcW w:type="dxa" w:w="2469"/>
+            <w:shd w:val="clear" w:color="auto" w:fill="18354A"/>
+          </w:tcPr>
+          <w:p>
+            <w:r>
+              <w:rPr>
+                <w:b/>
+                <w:color w:val="FFFFFF"/>
+                <w:sz w:val="17"/>
+              </w:rPr>
+              <w:t>Uso correto</w:t>
+            </w:r>
+          </w:p>
+        </w:tc>
+        <w:tc>
+          <w:tcPr>
+            <w:tcW w:type="dxa" w:w="2469"/>
+            <w:shd w:val="clear" w:color="auto" w:fill="18354A"/>
+          </w:tcPr>
+          <w:p>
+            <w:r>
+              <w:rPr>
+                <w:b/>
+                <w:color w:val="FFFFFF"/>
+                <w:sz w:val="17"/>
+              </w:rPr>
+              <w:t>Limite para o jogo</w:t>
+            </w:r>
+          </w:p>
+        </w:tc>
+      </w:tr>
+      <w:tr>
+        <w:tc>
+          <w:tcPr>
+            <w:tcW w:type="dxa" w:w="2469"/>
+          </w:tcPr>
+          <w:p>
+            <w:r>
+              <w:rPr>
+                <w:sz w:val="16"/>
+              </w:rPr>
+              <w:t>Graph Editor</w:t>
+            </w:r>
+          </w:p>
+        </w:tc>
+        <w:tc>
+          <w:tcPr>
+            <w:tcW w:type="dxa" w:w="2469"/>
+          </w:tcPr>
+          <w:p>
+            <w:r>
+              <w:rPr>
+                <w:sz w:val="16"/>
+              </w:rPr>
+              <w:t>Editor Type › Graph Editor; Key › Interpolation Mode / Handle Type</w:t>
+            </w:r>
+          </w:p>
+        </w:tc>
+        <w:tc>
+          <w:tcPr>
+            <w:tcW w:type="dxa" w:w="2469"/>
+          </w:tcPr>
+          <w:p>
+            <w:r>
+              <w:rPr>
+                <w:sz w:val="16"/>
+              </w:rPr>
+              <w:t>Spacing, easing, arcos, overshoot</w:t>
+            </w:r>
+          </w:p>
+        </w:tc>
+        <w:tc>
+          <w:tcPr>
+            <w:tcW w:type="dxa" w:w="2469"/>
+          </w:tcPr>
+          <w:p>
+            <w:r>
+              <w:rPr>
+                <w:sz w:val="16"/>
+              </w:rPr>
+              <w:t xml:space="preserve">Curva visual ≠ deslocamento físico (root vem da física salvo </w:t>
+            </w:r>
+            <w:r>
+              <w:rPr>
+                <w:rFonts w:ascii="Consolas" w:hAnsi="Consolas"/>
+                <w:sz w:val="16"/>
+              </w:rPr>
+              <w:t>rootMotion</w:t>
+            </w:r>
+            <w:r>
+              <w:rPr>
+                <w:sz w:val="16"/>
+              </w:rPr>
+              <w:t>)</w:t>
+            </w:r>
+          </w:p>
+        </w:tc>
+      </w:tr>
+      <w:tr>
+        <w:tc>
+          <w:tcPr>
+            <w:tcW w:type="dxa" w:w="2469"/>
+          </w:tcPr>
+          <w:p>
+            <w:r>
+              <w:rPr>
+                <w:sz w:val="16"/>
+              </w:rPr>
+              <w:t>Dope Sheet / Action Editor</w:t>
+            </w:r>
+          </w:p>
+        </w:tc>
+        <w:tc>
+          <w:tcPr>
+            <w:tcW w:type="dxa" w:w="2469"/>
+          </w:tcPr>
+          <w:p>
+            <w:r>
+              <w:rPr>
+                <w:sz w:val="16"/>
+              </w:rPr>
+              <w:t xml:space="preserve">Dope Sheet › Action Editor; seletor de Action </w:t>
+            </w:r>
+            <w:r>
+              <w:rPr>
+                <w:b/>
+                <w:sz w:val="16"/>
+              </w:rPr>
+              <w:t>e de slot</w:t>
+            </w:r>
+          </w:p>
+        </w:tc>
+        <w:tc>
+          <w:tcPr>
+            <w:tcW w:type="dxa" w:w="2469"/>
+          </w:tcPr>
+          <w:p>
+            <w:r>
+              <w:rPr>
+                <w:sz w:val="16"/>
+              </w:rPr>
+              <w:t>Duplicar Action, organizar poses-chave</w:t>
+            </w:r>
+          </w:p>
+        </w:tc>
+        <w:tc>
+          <w:tcPr>
+            <w:tcW w:type="dxa" w:w="2469"/>
+          </w:tcPr>
+          <w:p>
+            <w:r>
+              <w:rPr>
+                <w:sz w:val="16"/>
+              </w:rPr>
+              <w:t>Confira se a chave caiu na Action/slot pretendido</w:t>
+            </w:r>
+          </w:p>
+        </w:tc>
+      </w:tr>
+      <w:tr>
+        <w:tc>
+          <w:tcPr>
+            <w:tcW w:type="dxa" w:w="2469"/>
+          </w:tcPr>
+          <w:p>
+            <w:r>
+              <w:rPr>
+                <w:sz w:val="16"/>
+              </w:rPr>
+              <w:t>Pose Library</w:t>
+            </w:r>
+          </w:p>
+        </w:tc>
+        <w:tc>
+          <w:tcPr>
+            <w:tcW w:type="dxa" w:w="2469"/>
+          </w:tcPr>
+          <w:p>
+            <w:r>
+              <w:rPr>
+                <w:sz w:val="16"/>
+              </w:rPr>
+              <w:t>Dope Sheet › Action Editor ou Asset Shelf da 3D Viewport em Pose Mode; Pose › Create Pose Asset</w:t>
             </w:r>
           </w:p>
         </w:tc>

</xml_diff>

<commit_message>
fix(blender): reforca confiabilidade do Motion Lens
</commit_message>
<xml_diff>
--- a/docs/ARENAMON_Manual_Blender_Para_Agentes_IA_V2.docx
+++ b/docs/ARENAMON_Manual_Blender_Para_Agentes_IA_V2.docx
@@ -2325,39 +2325,26 @@
               <w:rPr>
                 <w:sz w:val="16"/>
               </w:rPr>
-              <w:t xml:space="preserve">. </w:t>
+              <w:t xml:space="preserve">. Versão 0.3.3, 17 operadores e 40 propriedades. Inclui </w:t>
             </w:r>
             <w:r>
               <w:rPr>
                 <w:rFonts w:ascii="Consolas" w:hAnsi="Consolas"/>
                 <w:sz w:val="16"/>
               </w:rPr>
-              <w:t>bl_info</w:t>
-            </w:r>
-            <w:r>
-              <w:rPr>
-                <w:sz w:val="16"/>
-              </w:rPr>
-              <w:t xml:space="preserve"> 0.3.1, mas o painel diz «0.4.0». Tem 17 operadores, incluindo </w:t>
+              <w:t>motionlens.strike</w:t>
+            </w:r>
+            <w:r>
+              <w:rPr>
+                <w:sz w:val="16"/>
+              </w:rPr>
+              <w:t xml:space="preserve"> (candidato de timing) e </w:t>
             </w:r>
             <w:r>
               <w:rPr>
                 <w:rFonts w:ascii="Consolas" w:hAnsi="Consolas"/>
                 <w:sz w:val="16"/>
               </w:rPr>
-              <w:t>motionlens.strike</w:t>
-            </w:r>
-            <w:r>
-              <w:rPr>
-                <w:sz w:val="16"/>
-              </w:rPr>
-              <w:t xml:space="preserve"> (Analisar golpe) e </w:t>
-            </w:r>
-            <w:r>
-              <w:rPr>
-                <w:rFonts w:ascii="Consolas" w:hAnsi="Consolas"/>
-                <w:sz w:val="16"/>
-              </w:rPr>
               <w:t>motionlens.apply_impact</w:t>
             </w:r>
             <w:r>
@@ -2377,7 +2364,7 @@
               <w:rPr>
                 <w:sz w:val="16"/>
               </w:rPr>
-              <w:t xml:space="preserve"> da Action com o bote retimado)</w:t>
+              <w:t xml:space="preserve"> transacional da Action)</w:t>
             </w:r>
           </w:p>
         </w:tc>
@@ -2391,7 +2378,7 @@
                 <w:b/>
                 <w:sz w:val="16"/>
               </w:rPr>
-              <w:t>0.3.1, arquivo único, 15 operadores, sem `strike`/`apply_impact`</w:t>
+              <w:t>0.3.2 modular, 15 operadores expostos; não foi reinstalado nesta auditoria</w:t>
             </w:r>
           </w:p>
         </w:tc>
@@ -2619,7 +2606,7 @@
       </w:r>
       <w:r>
         <w:rPr/>
-        <w:t xml:space="preserve"> descreve a versão 0.3.1 e ainda não registra essa diferença.</w:t>
+        <w:t xml:space="preserve"> registra separadamente a fonte e a cópia instalada.</w:t>
       </w:r>
     </w:p>
     <w:p>
@@ -9249,182 +9236,74 @@
         <w:t>14. Histórico</w:t>
       </w:r>
     </w:p>
-    <w:tbl>
-      <w:tblPr>
-        <w:tblStyle w:val="TableGrid"/>
-        <w:tblW w:type="auto" w:w="0"/>
-        <w:tblLook w:firstColumn="1" w:firstRow="1" w:lastColumn="0" w:lastRow="0" w:noHBand="0" w:noVBand="1" w:val="04A0"/>
-      </w:tblPr>
-      <w:tblGrid>
-        <w:gridCol w:w="3293"/>
-        <w:gridCol w:w="3293"/>
-        <w:gridCol w:w="3293"/>
-      </w:tblGrid>
-      <w:tr>
-        <w:tc>
-          <w:tcPr>
-            <w:tcW w:type="dxa" w:w="3293"/>
-            <w:shd w:val="clear" w:color="auto" w:fill="18354A"/>
-          </w:tcPr>
-          <w:p>
-            <w:r>
-              <w:rPr>
-                <w:b/>
-                <w:color w:val="FFFFFF"/>
-                <w:sz w:val="17"/>
-              </w:rPr>
-              <w:t>Versão</w:t>
-            </w:r>
-          </w:p>
-        </w:tc>
-        <w:tc>
-          <w:tcPr>
-            <w:tcW w:type="dxa" w:w="3293"/>
-            <w:shd w:val="clear" w:color="auto" w:fill="18354A"/>
-          </w:tcPr>
-          <w:p>
-            <w:r>
-              <w:rPr>
-                <w:b/>
-                <w:color w:val="FFFFFF"/>
-                <w:sz w:val="17"/>
-              </w:rPr>
-              <w:t>Data</w:t>
-            </w:r>
-          </w:p>
-        </w:tc>
-        <w:tc>
-          <w:tcPr>
-            <w:tcW w:type="dxa" w:w="3293"/>
-            <w:shd w:val="clear" w:color="auto" w:fill="18354A"/>
-          </w:tcPr>
-          <w:p>
-            <w:r>
-              <w:rPr>
-                <w:b/>
-                <w:color w:val="FFFFFF"/>
-                <w:sz w:val="17"/>
-              </w:rPr>
-              <w:t>Mudança</w:t>
-            </w:r>
-          </w:p>
-        </w:tc>
-      </w:tr>
-      <w:tr>
-        <w:tc>
-          <w:tcPr>
-            <w:tcW w:type="dxa" w:w="3293"/>
-          </w:tcPr>
-          <w:p>
-            <w:r>
-              <w:rPr>
-                <w:sz w:val="16"/>
-              </w:rPr>
-              <w:t>V1.0</w:t>
-            </w:r>
-          </w:p>
-        </w:tc>
-        <w:tc>
-          <w:tcPr>
-            <w:tcW w:type="dxa" w:w="3293"/>
-          </w:tcPr>
-          <w:p>
-            <w:r>
-              <w:rPr>
-                <w:sz w:val="16"/>
-              </w:rPr>
-              <w:t>30/10/2026</w:t>
-            </w:r>
-          </w:p>
-        </w:tc>
-        <w:tc>
-          <w:tcPr>
-            <w:tcW w:type="dxa" w:w="3293"/>
-          </w:tcPr>
-          <w:p>
-            <w:r>
-              <w:rPr>
-                <w:sz w:val="16"/>
-              </w:rPr>
-              <w:t xml:space="preserve">Versão inicial (DOCX), </w:t>
-            </w:r>
-            <w:r>
-              <w:rPr>
-                <w:sz w:val="16"/>
-              </w:rPr>
-              <w:t>preservada</w:t>
-            </w:r>
-          </w:p>
-        </w:tc>
-      </w:tr>
-      <w:tr>
-        <w:tc>
-          <w:tcPr>
-            <w:tcW w:type="dxa" w:w="3293"/>
-          </w:tcPr>
-          <w:p>
-            <w:r>
-              <w:rPr>
-                <w:sz w:val="16"/>
-              </w:rPr>
-              <w:t>V2.0</w:t>
-            </w:r>
-          </w:p>
-        </w:tc>
-        <w:tc>
-          <w:tcPr>
-            <w:tcW w:type="dxa" w:w="3293"/>
-          </w:tcPr>
-          <w:p>
-            <w:r>
-              <w:rPr>
-                <w:sz w:val="16"/>
-              </w:rPr>
-              <w:t>30/10/2026</w:t>
-            </w:r>
-          </w:p>
-        </w:tc>
-        <w:tc>
-          <w:tcPr>
-            <w:tcW w:type="dxa" w:w="3293"/>
-          </w:tcPr>
-          <w:p>
-            <w:r>
-              <w:rPr>
-                <w:sz w:val="16"/>
-              </w:rPr>
-              <w:t xml:space="preserve">Revisão após a </w:t>
-            </w:r>
-            <w:r>
-              <w:rPr>
-                <w:sz w:val="16"/>
-              </w:rPr>
-              <w:t>auditoria</w:t>
-            </w:r>
-            <w:r>
-              <w:rPr>
-                <w:sz w:val="16"/>
-              </w:rPr>
-              <w:t>: inventário das ferramentas existentes; modos A/B/C; Blender 5.2.2 e API de slots; Motion Lens repositório × instalado; MCP real; janelas de combate corrigidas (</w:t>
-            </w:r>
-            <w:r>
-              <w:rPr>
-                <w:rFonts w:ascii="Consolas" w:hAnsi="Consolas"/>
-                <w:sz w:val="16"/>
-              </w:rPr>
-              <w:t>overlayProfileWindows</w:t>
-            </w:r>
-            <w:r>
-              <w:rPr>
-                <w:sz w:val="16"/>
-              </w:rPr>
-              <w:t>); direitos conforme AGENTS.md com ressalva de licença; Bridge descartado em favor de estender o que existe</w:t>
-            </w:r>
-          </w:p>
-        </w:tc>
-      </w:tr>
-    </w:tbl>
-    <w:p/>
+    <w:p>
+      <w:pPr>
+        <w:pStyle w:val="BulletCompact"/>
+        <w:ind w:left="280"/>
+      </w:pPr>
+      <w:r>
+        <w:rPr/>
+        <w:t xml:space="preserve">•  </w:t>
+      </w:r>
+      <w:r>
+        <w:rPr>
+          <w:b/>
+        </w:rPr>
+        <w:t>V1.0 — 30/10/2026:</w:t>
+      </w:r>
+      <w:r>
+        <w:rPr/>
+        <w:t xml:space="preserve"> versão inicial (DOCX), </w:t>
+      </w:r>
+      <w:r>
+        <w:rPr/>
+        <w:t>preservada</w:t>
+      </w:r>
+      <w:r>
+        <w:rPr/>
+        <w:t>.</w:t>
+      </w:r>
+    </w:p>
+    <w:p>
+      <w:pPr>
+        <w:pStyle w:val="BulletCompact"/>
+        <w:ind w:left="280"/>
+      </w:pPr>
+      <w:r>
+        <w:rPr/>
+        <w:t xml:space="preserve">•  </w:t>
+      </w:r>
+      <w:r>
+        <w:rPr>
+          <w:b/>
+        </w:rPr>
+        <w:t>V2.0 — 30/10/2026:</w:t>
+      </w:r>
+      <w:r>
+        <w:rPr/>
+        <w:t xml:space="preserve"> auditoria técnica e governança.</w:t>
+      </w:r>
+    </w:p>
+    <w:p>
+      <w:pPr>
+        <w:pStyle w:val="BulletCompact"/>
+        <w:ind w:left="280"/>
+      </w:pPr>
+      <w:r>
+        <w:rPr/>
+        <w:t xml:space="preserve">•  </w:t>
+      </w:r>
+      <w:r>
+        <w:rPr>
+          <w:b/>
+        </w:rPr>
+        <w:t>V2.1 — 31/10/2026:</w:t>
+      </w:r>
+      <w:r>
+        <w:rPr/>
+        <w:t xml:space="preserve"> Motion Lens 0.3.3.</w:t>
+      </w:r>
+    </w:p>
     <w:sectPr>
       <w:headerReference w:type="default" r:id="rId9"/>
       <w:footerReference w:type="default" r:id="rId10"/>

</xml_diff>

<commit_message>
fix(blender): preserva estado nas comparacoes
</commit_message>
<xml_diff>
--- a/docs/ARENAMON_Manual_Blender_Para_Agentes_IA_V2.docx
+++ b/docs/ARENAMON_Manual_Blender_Para_Agentes_IA_V2.docx
@@ -2414,72 +2414,7 @@
               <w:rPr>
                 <w:sz w:val="16"/>
               </w:rPr>
-              <w:t xml:space="preserve"> 0.1.0 (</w:t>
-            </w:r>
-            <w:r>
-              <w:rPr>
-                <w:rFonts w:ascii="Consolas" w:hAnsi="Consolas"/>
-                <w:sz w:val="16"/>
-              </w:rPr>
-              <w:t>new_motion</w:t>
-            </w:r>
-            <w:r>
-              <w:rPr>
-                <w:sz w:val="16"/>
-              </w:rPr>
-              <w:t xml:space="preserve">, </w:t>
-            </w:r>
-            <w:r>
-              <w:rPr>
-                <w:rFonts w:ascii="Consolas" w:hAnsi="Consolas"/>
-                <w:sz w:val="16"/>
-              </w:rPr>
-              <w:t>new_action</w:t>
-            </w:r>
-            <w:r>
-              <w:rPr>
-                <w:sz w:val="16"/>
-              </w:rPr>
-              <w:t xml:space="preserve">, </w:t>
-            </w:r>
-            <w:r>
-              <w:rPr>
-                <w:rFonts w:ascii="Consolas" w:hAnsi="Consolas"/>
-                <w:sz w:val="16"/>
-              </w:rPr>
-              <w:t>dump</w:t>
-            </w:r>
-            <w:r>
-              <w:rPr>
-                <w:sz w:val="16"/>
-              </w:rPr>
-              <w:t xml:space="preserve">, </w:t>
-            </w:r>
-            <w:r>
-              <w:rPr>
-                <w:rFonts w:ascii="Consolas" w:hAnsi="Consolas"/>
-                <w:sz w:val="16"/>
-              </w:rPr>
-              <w:t>compare</w:t>
-            </w:r>
-            <w:r>
-              <w:rPr>
-                <w:sz w:val="16"/>
-              </w:rPr>
-              <w:t xml:space="preserve">, </w:t>
-            </w:r>
-            <w:r>
-              <w:rPr>
-                <w:rFonts w:ascii="Consolas" w:hAnsi="Consolas"/>
-                <w:sz w:val="16"/>
-              </w:rPr>
-              <w:t>clear</w:t>
-            </w:r>
-            <w:r>
-              <w:rPr>
-                <w:sz w:val="16"/>
-              </w:rPr>
-              <w:t>)</w:t>
+              <w:t xml:space="preserve"> 0.1.2; 5 operadores; frame/subframe protegido sob falha</w:t>
             </w:r>
           </w:p>
         </w:tc>
@@ -2492,7 +2427,7 @@
               <w:rPr>
                 <w:sz w:val="16"/>
               </w:rPr>
-              <w:t>0.1.0, os mesmos 5 operadores</w:t>
+              <w:t>0.1.1; 5 operadores; não reinstalado</w:t>
             </w:r>
           </w:p>
         </w:tc>

</xml_diff>